<commit_message>
update to UV templates
</commit_message>
<xml_diff>
--- a/flow/20230914_vu_template/drafts/2023-11-u/01-СР-свсмч.Теодора Ромжі.docx
+++ b/flow/20230914_vu_template/drafts/2023-11-u/01-СР-свсмч.Теодора Ромжі.docx
@@ -4,16 +4,29 @@
   <w:body>
     <w:p>
       <w:r>
+        <w:rPr>
+          <w:rFonts w:ascii="Times New Roman" w:hAnsi="Times New Roman"/>
+          <w:sz w:val="24"/>
+        </w:rPr>
         <w:t>Листопад 1 Середа</w:t>
       </w:r>
     </w:p>
     <w:p>
       <w:r>
+        <w:rPr>
+          <w:rFonts w:ascii="Times New Roman" w:hAnsi="Times New Roman"/>
+          <w:color w:val="FF4400"/>
+          <w:sz w:val="24"/>
+        </w:rPr>
         <w:t>🕂Священномученика Теодора Ромжі, єпископа Мукачівського</w:t>
       </w:r>
     </w:p>
     <w:p>
       <w:r>
+        <w:rPr>
+          <w:rFonts w:ascii="Times New Roman" w:hAnsi="Times New Roman"/>
+          <w:sz w:val="24"/>
+        </w:rPr>
         <w:t>🕃 Святих чудотворців і безсрібників Косми й Дам’яна</w:t>
       </w:r>
     </w:p>

</xml_diff>